<commit_message>
M2b: apply design review to the document model
String tables (en, fr) with overrides, plain-language logic without
variable names by default, select layouts, or_other write-in rows,
script-aware complex-script font, WGL4 answer symbols, template cleanup.

Co-Authored-By: Claude Opus 5.5 <noreply@anthropic.com>
</commit_message>
<xml_diff>
--- a/inst/templates/convertxlsform.docx
+++ b/inst/templates/convertxlsform.docx
@@ -1192,6 +1192,7 @@
     <w:basedOn w:val="Normal"/>
     <w:pPr>
       <w:jc w:val="left"/>
+      <w:keepNext/>
       <w:pBdr>
         <w:bottom w:val="none" w:sz="0" w:space="0" w:color="000000"/>
         <w:top w:val="none" w:sz="0" w:space="0" w:color="000000"/>
@@ -1284,27 +1285,6 @@
       <w:sz w:val="20"/>
       <w:szCs w:val="20"/>
       <w:color w:val="1F3864"/>
-    </w:rPr>
-  </w:style>
-  <w:style xmlns:w="http://schemas.openxmlformats.org/wordprocessingml/2006/main" w:type="character" w:customStyle="1" w:styleId="cxfRequired">
-    <w:name w:val="cxf Required"/>
-    <w:basedOn w:val="Policepardfaut"/>
-    <w:rPr>
-      <w:rFonts/>
-      <w:b w:val="true"/>
-      <w:strike w:val="false"/>
-      <w:color w:val="C00000"/>
-    </w:rPr>
-  </w:style>
-  <w:style xmlns:w="http://schemas.openxmlformats.org/wordprocessingml/2006/main" w:type="character" w:customStyle="1" w:styleId="cxfCode">
-    <w:name w:val="cxf Code"/>
-    <w:basedOn w:val="Policepardfaut"/>
-    <w:rPr>
-      <w:rFonts w:ascii="Arial"/>
-      <w:strike w:val="false"/>
-      <w:sz w:val="18"/>
-      <w:szCs w:val="18"/>
-      <w:color w:val="595959"/>
     </w:rPr>
   </w:style>
 </w:styles>

</xml_diff>